<commit_message>
Add validation for course assignment in enrollment process and update query for available courses
</commit_message>
<xml_diff>
--- a/2026-07-07-Informe-Pruebas-Selenium-E2E.docx
+++ b/2026-07-07-Informe-Pruebas-Selenium-E2E.docx
@@ -2438,82 +2438,72 @@
       </w:r>
     </w:p>
     <w:p>
+      <w:r>
+        <w:t xml:space="preserve">.\mvnw.cmd </w:t>
+      </w:r>
+      <w:proofErr w:type="spellStart"/>
+      <w:r>
+        <w:t>verify</w:t>
+      </w:r>
+      <w:proofErr w:type="spellEnd"/>
+      <w:r>
+        <w:t xml:space="preserve"> -Pe2e "-</w:t>
+      </w:r>
+      <w:proofErr w:type="spellStart"/>
+      <w:r>
+        <w:t>Dit.test</w:t>
+      </w:r>
+      <w:proofErr w:type="spellEnd"/>
+      <w:r>
+        <w:t>=</w:t>
+      </w:r>
+      <w:proofErr w:type="spellStart"/>
+      <w:r>
+        <w:t>InscripcionHorarioIT</w:t>
+      </w:r>
+      <w:proofErr w:type="spellEnd"/>
+      <w:r>
+        <w:t>" "-</w:t>
+      </w:r>
+      <w:proofErr w:type="spellStart"/>
+      <w:r>
+        <w:t>Dtest</w:t>
+      </w:r>
+      <w:proofErr w:type="spellEnd"/>
+      <w:r>
+        <w:t>=</w:t>
+      </w:r>
+      <w:proofErr w:type="spellStart"/>
+      <w:r>
+        <w:t>NingunTestUnitario</w:t>
+      </w:r>
+      <w:proofErr w:type="spellEnd"/>
+      <w:r>
+        <w:t>" "-</w:t>
+      </w:r>
+      <w:proofErr w:type="spellStart"/>
+      <w:r>
+        <w:t>Dsurefire.failIfNoSpecifiedTests</w:t>
+      </w:r>
+      <w:proofErr w:type="spellEnd"/>
+      <w:r>
+        <w:t>=false" "-De2e.evidencia=true" "-De2e.admin.email=admin@prueba.com" "-</w:t>
+      </w:r>
       <w:proofErr w:type="gramStart"/>
       <w:r>
-        <w:t>./</w:t>
-      </w:r>
-      <w:proofErr w:type="spellStart"/>
+        <w:t>De2e.admin.password</w:t>
+      </w:r>
       <w:proofErr w:type="gramEnd"/>
       <w:r>
-        <w:t>mvnw</w:t>
-      </w:r>
-      <w:proofErr w:type="spellEnd"/>
-      <w:r>
-        <w:t xml:space="preserve"> </w:t>
-      </w:r>
-      <w:proofErr w:type="spellStart"/>
-      <w:r>
-        <w:t>verify</w:t>
-      </w:r>
-      <w:proofErr w:type="spellEnd"/>
-      <w:r>
-        <w:t xml:space="preserve"> -Pe2e -</w:t>
-      </w:r>
-      <w:proofErr w:type="spellStart"/>
-      <w:r>
-        <w:t>Dit.test</w:t>
-      </w:r>
-      <w:proofErr w:type="spellEnd"/>
-      <w:r>
-        <w:t>=</w:t>
-      </w:r>
-      <w:proofErr w:type="spellStart"/>
-      <w:r>
-        <w:t>InscripcionHorarioIT</w:t>
-      </w:r>
-      <w:proofErr w:type="spellEnd"/>
-      <w:r>
-        <w:t xml:space="preserve"> -</w:t>
-      </w:r>
-      <w:proofErr w:type="spellStart"/>
-      <w:r>
-        <w:t>Dtest</w:t>
-      </w:r>
-      <w:proofErr w:type="spellEnd"/>
-      <w:r>
-        <w:t>=</w:t>
-      </w:r>
-      <w:proofErr w:type="spellStart"/>
-      <w:r>
-        <w:t>NingunTestUnitario</w:t>
-      </w:r>
-      <w:proofErr w:type="spellEnd"/>
-      <w:r>
-        <w:t xml:space="preserve"> -</w:t>
-      </w:r>
-      <w:proofErr w:type="spellStart"/>
-      <w:r>
-        <w:t>Dsurefire.failIfNoSpecifiedTests</w:t>
-      </w:r>
-      <w:proofErr w:type="spellEnd"/>
-      <w:r>
-        <w:t>=false -De2e.evidencia=true -De2e.admin.email=admin@prueba.com -</w:t>
+        <w:t>=123456" "-De2e.alumno.email=alumno@prueba.com" "-</w:t>
       </w:r>
       <w:proofErr w:type="gramStart"/>
       <w:r>
-        <w:t>De2e.admin.password</w:t>
+        <w:t>De2e.alumno.password</w:t>
       </w:r>
       <w:proofErr w:type="gramEnd"/>
       <w:r>
-        <w:t>=123456 -De2e.alumno.email=alumno@prueba.com -</w:t>
-      </w:r>
-      <w:proofErr w:type="gramStart"/>
-      <w:r>
-        <w:t>De2e.alumno.password</w:t>
-      </w:r>
-      <w:proofErr w:type="gramEnd"/>
-      <w:r>
-        <w:t>=123456</w:t>
+        <w:t>=123456"</w:t>
       </w:r>
     </w:p>
     <w:sectPr>

</xml_diff>